<commit_message>
Knowledge - 2-Science - fix sources - 11/7/2025
</commit_message>
<xml_diff>
--- a/Knowledge/2-Science/0-Intro to Science/3-Wiki Source/Outline of science/Sources.docx
+++ b/Knowledge/2-Science/0-Intro to Science/3-Wiki Source/Outline of science/Sources.docx
@@ -2,34 +2,14 @@
 <file path=word/document.xml><?xml version="1.0" encoding="utf-8"?>
 <w:document xmlns:wpc="http://schemas.microsoft.com/office/word/2010/wordprocessingCanvas" xmlns:cx="http://schemas.microsoft.com/office/drawing/2014/chartex" xmlns:cx1="http://schemas.microsoft.com/office/drawing/2015/9/8/chartex" xmlns:cx2="http://schemas.microsoft.com/office/drawing/2015/10/21/chartex" xmlns:cx3="http://schemas.microsoft.com/office/drawing/2016/5/9/chartex" xmlns:cx4="http://schemas.microsoft.com/office/drawing/2016/5/10/chartex" xmlns:cx5="http://schemas.microsoft.com/office/drawing/2016/5/11/chartex" xmlns:cx6="http://schemas.microsoft.com/office/drawing/2016/5/12/chartex" xmlns:cx7="http://schemas.microsoft.com/office/drawing/2016/5/13/chartex" xmlns:cx8="http://schemas.microsoft.com/office/drawing/2016/5/14/chartex" xmlns:mc="http://schemas.openxmlformats.org/markup-compatibility/2006" xmlns:aink="http://schemas.microsoft.com/office/drawing/2016/ink" xmlns:am3d="http://schemas.microsoft.com/office/drawing/2017/model3d" xmlns:o="urn:schemas-microsoft-com:office:office" xmlns:oel="http://schemas.microsoft.com/office/2019/extlst" xmlns:r="http://schemas.openxmlformats.org/officeDocument/2006/relationships" xmlns:m="http://schemas.openxmlformats.org/officeDocument/2006/math" xmlns:v="urn:schemas-microsoft-com:vml" xmlns:wp14="http://schemas.microsoft.com/office/word/2010/wordprocessingDrawing" xmlns:wp="http://schemas.openxmlformats.org/drawingml/2006/wordprocessingDrawing" xmlns:w10="urn:schemas-microsoft-com:office:word" xmlns:w="http://schemas.openxmlformats.org/wordprocessingml/2006/main" xmlns:w14="http://schemas.microsoft.com/office/word/2010/wordml" xmlns:w15="http://schemas.microsoft.com/office/word/2012/wordml" xmlns:w16cex="http://schemas.microsoft.com/office/word/2018/wordml/cex" xmlns:w16cid="http://schemas.microsoft.com/office/word/2016/wordml/cid" xmlns:w16="http://schemas.microsoft.com/office/word/2018/wordml" xmlns:w16du="http://schemas.microsoft.com/office/word/2023/wordml/word16du" xmlns:w16sdtdh="http://schemas.microsoft.com/office/word/2020/wordml/sdtdatahash" xmlns:w16sdtfl="http://schemas.microsoft.com/office/word/2024/wordml/sdtformatlock" xmlns:w16se="http://schemas.microsoft.com/office/word/2015/wordml/symex" xmlns:wpg="http://schemas.microsoft.com/office/word/2010/wordprocessingGroup" xmlns:wpi="http://schemas.microsoft.com/office/word/2010/wordprocessingInk" xmlns:wne="http://schemas.microsoft.com/office/word/2006/wordml" xmlns:wps="http://schemas.microsoft.com/office/word/2010/wordprocessingShape" mc:Ignorable="w14 w15 w16se w16cid w16 w16cex w16sdtdh w16sdtfl w16du wp14">
   <w:body>
+    <w:p/>
     <w:p>
       <w:pPr>
-        <w:rPr>
-          <w:b/>
-        </w:rPr>
-      </w:pPr>
-    </w:p>
-    <w:p>
-      <w:pPr>
-        <w:rPr>
-          <w:b/>
-        </w:rPr>
-      </w:pPr>
-    </w:p>
-    <w:p>
-      <w:pPr>
-        <w:rPr>
-          <w:b/>
-        </w:rPr>
-      </w:pPr>
-    </w:p>
-    <w:p>
-      <w:pPr>
+        <w:pStyle w:val="ListParagraph"/>
         <w:numPr>
           <w:ilvl w:val="0"/>
-          <w:numId w:val="1"/>
+          <w:numId w:val="3"/>
         </w:numPr>
-        <w:spacing w:before="240" w:after="240"/>
       </w:pPr>
       <w:r>
         <w:rPr>
@@ -38,7 +18,34 @@
         <w:t>* Download Name</w:t>
       </w:r>
       <w:r>
-        <w:t>: Outline of science</w:t>
+        <w:t xml:space="preserve">: </w:t>
+      </w:r>
+      <w:r>
+        <w:t>[</w:t>
+      </w:r>
+      <w:r>
+        <w:t>en_wikipedia_org_wiki_Outline_of_science</w:t>
+      </w:r>
+      <w:r>
+        <w:t>.pdf</w:t>
+      </w:r>
+      <w:r>
+        <w:t xml:space="preserve"> -&gt; </w:t>
+      </w:r>
+      <w:r>
+        <w:t>Outline of science.pdf</w:t>
+      </w:r>
+      <w:r>
+        <w:t xml:space="preserve">] </w:t>
+      </w:r>
+      <w:r>
+        <w:t>[</w:t>
+      </w:r>
+      <w:r>
+        <w:t>Wiki Source - Outline of science</w:t>
+      </w:r>
+      <w:r>
+        <w:t>]</w:t>
       </w:r>
       <w:r>
         <w:br/>
@@ -65,6 +72,22 @@
       </w:r>
       <w:r>
         <w:t>: Educational</w:t>
+      </w:r>
+      <w:r>
+        <w:br/>
+      </w:r>
+      <w:r>
+        <w:t xml:space="preserve">* </w:t>
+      </w:r>
+      <w:r>
+        <w:rPr>
+          <w:b/>
+          <w:bCs/>
+        </w:rPr>
+        <w:t>Source Platform</w:t>
+      </w:r>
+      <w:r>
+        <w:t>: Wikipedia (https://www.wikipedia.org)</w:t>
       </w:r>
       <w:r>
         <w:br/>
@@ -90,8 +113,6 @@
       </w:hyperlink>
       <w:r>
         <w:br/>
-      </w:r>
-      <w:r>
         <w:t xml:space="preserve">* </w:t>
       </w:r>
       <w:r>
@@ -104,10 +125,7 @@
         <w:t xml:space="preserve">: </w:t>
       </w:r>
       <w:r>
-        <w:t>en.wikipedia.org</w:t>
-      </w:r>
-      <w:r>
-        <w:t xml:space="preserve"> </w:t>
+        <w:t>https://en.wikipedia.org [Wikipedia Server]</w:t>
       </w:r>
       <w:r>
         <w:br/>
@@ -122,24 +140,13 @@
       <w:r>
         <w:t xml:space="preserve">: </w:t>
       </w:r>
-      <w:hyperlink r:id="rId6">
-        <w:r>
-          <w:rPr>
-            <w:b/>
-            <w:color w:val="1155CC"/>
-            <w:u w:val="single"/>
-          </w:rPr>
-          <w:t>https://www.sejda.com/html-to-pdf</w:t>
-        </w:r>
-      </w:hyperlink>
-      <w:r>
-        <w:rPr>
-          <w:b/>
-        </w:rPr>
-        <w:t xml:space="preserve"> -&gt; convert html to pdf</w:t>
-      </w:r>
-      <w:r>
-        <w:br/>
+      <w:r>
+        <w:t>Web Tool: Sejda - HTML to PDF (https://www.sejda.com/html-to-pdf) [convert html to pdf]</w:t>
+      </w:r>
+      <w:r>
+        <w:br/>
+      </w:r>
+      <w:r>
         <w:t xml:space="preserve">* </w:t>
       </w:r>
       <w:r>
@@ -179,45 +186,37 @@
       </w:r>
       <w:r>
         <w:br/>
-        <w:t xml:space="preserve">* </w:t>
-      </w:r>
-      <w:r>
-        <w:rPr>
-          <w:b/>
+      </w:r>
+      <w:r>
+        <w:t xml:space="preserve">* </w:t>
+      </w:r>
+      <w:r>
+        <w:rPr>
+          <w:b/>
+          <w:bCs/>
         </w:rPr>
         <w:t>Saved Location</w:t>
       </w:r>
       <w:r>
-        <w:t xml:space="preserve">: </w:t>
+        <w:t>: StorageType: Cloud -&gt; Platform: GitHub -&gt; Account: topicsscience -&gt; Repository: kingdomheartsknowledge -&gt; Path: Knowledge/2-Science/0-Intro to Science/..</w:t>
+      </w:r>
+      <w:r>
+        <w:br/>
+      </w:r>
+      <w:r>
+        <w:t xml:space="preserve">* </w:t>
+      </w:r>
+      <w:r>
+        <w:rPr>
+          <w:b/>
+        </w:rPr>
+        <w:t xml:space="preserve">Notes: </w:t>
       </w:r>
       <w:r>
         <w:rPr>
           <w:sz w:val="20"/>
           <w:szCs w:val="20"/>
         </w:rPr>
-        <w:t>treeknowledge561\Knowledge\Science\0-Intro to Science\3-Wiki source\Outline of science</w:t>
-      </w:r>
-      <w:r>
-        <w:rPr>
-          <w:sz w:val="20"/>
-          <w:szCs w:val="20"/>
-        </w:rPr>
-        <w:br/>
-      </w:r>
-      <w:r>
-        <w:t xml:space="preserve">* </w:t>
-      </w:r>
-      <w:r>
-        <w:rPr>
-          <w:b/>
-        </w:rPr>
-        <w:t xml:space="preserve">Notes: </w:t>
-      </w:r>
-      <w:r>
-        <w:rPr>
-          <w:sz w:val="20"/>
-          <w:szCs w:val="20"/>
-        </w:rPr>
         <w:t>Wiki Source -</w:t>
       </w:r>
       <w:r>
@@ -247,9 +246,10 @@
     </w:p>
     <w:p>
       <w:pPr>
+        <w:pStyle w:val="ListParagraph"/>
         <w:numPr>
           <w:ilvl w:val="0"/>
-          <w:numId w:val="1"/>
+          <w:numId w:val="3"/>
         </w:numPr>
         <w:spacing w:before="240" w:after="240"/>
         <w:rPr>
@@ -264,7 +264,28 @@
         <w:t>* Download Name</w:t>
       </w:r>
       <w:r>
-        <w:t>: Branches of science</w:t>
+        <w:t xml:space="preserve">: </w:t>
+      </w:r>
+      <w:r>
+        <w:t>[</w:t>
+      </w:r>
+      <w:r>
+        <w:t>en_wikipedia_org_wiki_Branches_of_science</w:t>
+      </w:r>
+      <w:r>
+        <w:t xml:space="preserve">.pdf -&gt; </w:t>
+      </w:r>
+      <w:r>
+        <w:t>Branches of science.pdf</w:t>
+      </w:r>
+      <w:r>
+        <w:t>] [</w:t>
+      </w:r>
+      <w:r>
+        <w:t>Wiki Source - Branches of science</w:t>
+      </w:r>
+      <w:r>
+        <w:t>]</w:t>
       </w:r>
       <w:r>
         <w:br/>
@@ -294,6 +315,22 @@
       </w:r>
       <w:r>
         <w:br/>
+      </w:r>
+      <w:r>
+        <w:t xml:space="preserve">* </w:t>
+      </w:r>
+      <w:r>
+        <w:rPr>
+          <w:b/>
+          <w:bCs/>
+        </w:rPr>
+        <w:t>Source Platform</w:t>
+      </w:r>
+      <w:r>
+        <w:t>: Wikipedia (https://www.wikipedia.org)</w:t>
+      </w:r>
+      <w:r>
+        <w:br/>
         <w:t xml:space="preserve">* </w:t>
       </w:r>
       <w:r>
@@ -305,7 +342,7 @@
       <w:r>
         <w:t xml:space="preserve">: </w:t>
       </w:r>
-      <w:hyperlink r:id="rId7">
+      <w:hyperlink r:id="rId6">
         <w:r>
           <w:rPr>
             <w:color w:val="1155CC"/>
@@ -330,10 +367,7 @@
         <w:t xml:space="preserve">: </w:t>
       </w:r>
       <w:r>
-        <w:t>en.wikipedia.org</w:t>
-      </w:r>
-      <w:r>
-        <w:t xml:space="preserve"> </w:t>
+        <w:t>https://en.wikipedia.org [Wikipedia Server]</w:t>
       </w:r>
       <w:r>
         <w:br/>
@@ -348,24 +382,13 @@
       <w:r>
         <w:t xml:space="preserve">: </w:t>
       </w:r>
-      <w:hyperlink r:id="rId8">
-        <w:r>
-          <w:rPr>
-            <w:b/>
-            <w:color w:val="1155CC"/>
-            <w:u w:val="single"/>
-          </w:rPr>
-          <w:t>https://www.sejda.com/html-to-pdf</w:t>
-        </w:r>
-      </w:hyperlink>
-      <w:r>
-        <w:rPr>
-          <w:b/>
-        </w:rPr>
-        <w:t xml:space="preserve"> -&gt; convert html to pdf</w:t>
-      </w:r>
-      <w:r>
-        <w:br/>
+      <w:r>
+        <w:t>Web Tool: Sejda - HTML to PDF (https://www.sejda.com/html-to-pdf) [convert html to pdf]</w:t>
+      </w:r>
+      <w:r>
+        <w:br/>
+      </w:r>
+      <w:r>
         <w:t xml:space="preserve">* </w:t>
       </w:r>
       <w:r>
@@ -405,29 +428,21 @@
       </w:r>
       <w:r>
         <w:br/>
-        <w:t xml:space="preserve">* </w:t>
-      </w:r>
-      <w:r>
-        <w:rPr>
-          <w:b/>
+      </w:r>
+      <w:r>
+        <w:t xml:space="preserve">* </w:t>
+      </w:r>
+      <w:r>
+        <w:rPr>
+          <w:b/>
+          <w:bCs/>
         </w:rPr>
         <w:t>Saved Location</w:t>
       </w:r>
       <w:r>
-        <w:t xml:space="preserve">: </w:t>
-      </w:r>
-      <w:r>
-        <w:rPr>
-          <w:sz w:val="20"/>
-          <w:szCs w:val="20"/>
-        </w:rPr>
-        <w:t>treeknowledge561\Knowledge\Science\0-Intro to Science\3-Wiki source\Outline of science</w:t>
-      </w:r>
-      <w:r>
-        <w:rPr>
-          <w:sz w:val="20"/>
-          <w:szCs w:val="20"/>
-        </w:rPr>
+        <w:t>: StorageType: Cloud -&gt; Platform: GitHub -&gt; Account: topicsscience -&gt; Repository: kingdomheartsknowledge -&gt; Path: Knowledge/2-Science/0-Intro to Science/..</w:t>
+      </w:r>
+      <w:r>
         <w:br/>
       </w:r>
       <w:r>
@@ -497,6 +512,92 @@
 <file path=word/numbering.xml><?xml version="1.0" encoding="utf-8"?>
 <w:numbering xmlns:wpc="http://schemas.microsoft.com/office/word/2010/wordprocessingCanvas" xmlns:cx="http://schemas.microsoft.com/office/drawing/2014/chartex" xmlns:cx1="http://schemas.microsoft.com/office/drawing/2015/9/8/chartex" xmlns:cx2="http://schemas.microsoft.com/office/drawing/2015/10/21/chartex" xmlns:cx3="http://schemas.microsoft.com/office/drawing/2016/5/9/chartex" xmlns:cx4="http://schemas.microsoft.com/office/drawing/2016/5/10/chartex" xmlns:cx5="http://schemas.microsoft.com/office/drawing/2016/5/11/chartex" xmlns:cx6="http://schemas.microsoft.com/office/drawing/2016/5/12/chartex" xmlns:cx7="http://schemas.microsoft.com/office/drawing/2016/5/13/chartex" xmlns:cx8="http://schemas.microsoft.com/office/drawing/2016/5/14/chartex" xmlns:mc="http://schemas.openxmlformats.org/markup-compatibility/2006" xmlns:aink="http://schemas.microsoft.com/office/drawing/2016/ink" xmlns:am3d="http://schemas.microsoft.com/office/drawing/2017/model3d" xmlns:o="urn:schemas-microsoft-com:office:office" xmlns:oel="http://schemas.microsoft.com/office/2019/extlst" xmlns:r="http://schemas.openxmlformats.org/officeDocument/2006/relationships" xmlns:m="http://schemas.openxmlformats.org/officeDocument/2006/math" xmlns:v="urn:schemas-microsoft-com:vml" xmlns:wp14="http://schemas.microsoft.com/office/word/2010/wordprocessingDrawing" xmlns:wp="http://schemas.openxmlformats.org/drawingml/2006/wordprocessingDrawing" xmlns:w10="urn:schemas-microsoft-com:office:word" xmlns:w="http://schemas.openxmlformats.org/wordprocessingml/2006/main" xmlns:w14="http://schemas.microsoft.com/office/word/2010/wordml" xmlns:w15="http://schemas.microsoft.com/office/word/2012/wordml" xmlns:w16cex="http://schemas.microsoft.com/office/word/2018/wordml/cex" xmlns:w16cid="http://schemas.microsoft.com/office/word/2016/wordml/cid" xmlns:w16="http://schemas.microsoft.com/office/word/2018/wordml" xmlns:w16du="http://schemas.microsoft.com/office/word/2023/wordml/word16du" xmlns:w16sdtdh="http://schemas.microsoft.com/office/word/2020/wordml/sdtdatahash" xmlns:w16sdtfl="http://schemas.microsoft.com/office/word/2024/wordml/sdtformatlock" xmlns:w16se="http://schemas.microsoft.com/office/word/2015/wordml/symex" xmlns:wpg="http://schemas.microsoft.com/office/word/2010/wordprocessingGroup" xmlns:wpi="http://schemas.microsoft.com/office/word/2010/wordprocessingInk" xmlns:wne="http://schemas.microsoft.com/office/word/2006/wordml" xmlns:wps="http://schemas.microsoft.com/office/word/2010/wordprocessingShape" mc:Ignorable="w14 w15 w16se w16cid w16 w16cex w16sdtdh w16sdtfl w16du wp14">
   <w:abstractNum w:abstractNumId="0" w15:restartNumberingAfterBreak="0">
+    <w:nsid w:val="27C56103"/>
+    <w:multiLevelType w:val="hybridMultilevel"/>
+    <w:tmpl w:val="D4E4E5A8"/>
+    <w:lvl w:ilvl="0" w:tplc="0409000F">
+      <w:start w:val="1"/>
+      <w:numFmt w:val="decimal"/>
+      <w:lvlText w:val="%1."/>
+      <w:lvlJc w:val="left"/>
+      <w:pPr>
+        <w:ind w:left="720" w:hanging="360"/>
+      </w:pPr>
+    </w:lvl>
+    <w:lvl w:ilvl="1" w:tplc="04090019" w:tentative="1">
+      <w:start w:val="1"/>
+      <w:numFmt w:val="lowerLetter"/>
+      <w:lvlText w:val="%2."/>
+      <w:lvlJc w:val="left"/>
+      <w:pPr>
+        <w:ind w:left="1440" w:hanging="360"/>
+      </w:pPr>
+    </w:lvl>
+    <w:lvl w:ilvl="2" w:tplc="0409001B" w:tentative="1">
+      <w:start w:val="1"/>
+      <w:numFmt w:val="lowerRoman"/>
+      <w:lvlText w:val="%3."/>
+      <w:lvlJc w:val="right"/>
+      <w:pPr>
+        <w:ind w:left="2160" w:hanging="180"/>
+      </w:pPr>
+    </w:lvl>
+    <w:lvl w:ilvl="3" w:tplc="0409000F" w:tentative="1">
+      <w:start w:val="1"/>
+      <w:numFmt w:val="decimal"/>
+      <w:lvlText w:val="%4."/>
+      <w:lvlJc w:val="left"/>
+      <w:pPr>
+        <w:ind w:left="2880" w:hanging="360"/>
+      </w:pPr>
+    </w:lvl>
+    <w:lvl w:ilvl="4" w:tplc="04090019" w:tentative="1">
+      <w:start w:val="1"/>
+      <w:numFmt w:val="lowerLetter"/>
+      <w:lvlText w:val="%5."/>
+      <w:lvlJc w:val="left"/>
+      <w:pPr>
+        <w:ind w:left="3600" w:hanging="360"/>
+      </w:pPr>
+    </w:lvl>
+    <w:lvl w:ilvl="5" w:tplc="0409001B" w:tentative="1">
+      <w:start w:val="1"/>
+      <w:numFmt w:val="lowerRoman"/>
+      <w:lvlText w:val="%6."/>
+      <w:lvlJc w:val="right"/>
+      <w:pPr>
+        <w:ind w:left="4320" w:hanging="180"/>
+      </w:pPr>
+    </w:lvl>
+    <w:lvl w:ilvl="6" w:tplc="0409000F" w:tentative="1">
+      <w:start w:val="1"/>
+      <w:numFmt w:val="decimal"/>
+      <w:lvlText w:val="%7."/>
+      <w:lvlJc w:val="left"/>
+      <w:pPr>
+        <w:ind w:left="5040" w:hanging="360"/>
+      </w:pPr>
+    </w:lvl>
+    <w:lvl w:ilvl="7" w:tplc="04090019" w:tentative="1">
+      <w:start w:val="1"/>
+      <w:numFmt w:val="lowerLetter"/>
+      <w:lvlText w:val="%8."/>
+      <w:lvlJc w:val="left"/>
+      <w:pPr>
+        <w:ind w:left="5760" w:hanging="360"/>
+      </w:pPr>
+    </w:lvl>
+    <w:lvl w:ilvl="8" w:tplc="0409001B" w:tentative="1">
+      <w:start w:val="1"/>
+      <w:numFmt w:val="lowerRoman"/>
+      <w:lvlText w:val="%9."/>
+      <w:lvlJc w:val="right"/>
+      <w:pPr>
+        <w:ind w:left="6480" w:hanging="180"/>
+      </w:pPr>
+    </w:lvl>
+  </w:abstractNum>
+  <w:abstractNum w:abstractNumId="1" w15:restartNumberingAfterBreak="0">
     <w:nsid w:val="30AF57A6"/>
     <w:multiLevelType w:val="multilevel"/>
     <w:tmpl w:val="614643A0"/>
@@ -611,7 +712,126 @@
       </w:rPr>
     </w:lvl>
   </w:abstractNum>
+  <w:abstractNum w:abstractNumId="2" w15:restartNumberingAfterBreak="0">
+    <w:nsid w:val="640B58DB"/>
+    <w:multiLevelType w:val="hybridMultilevel"/>
+    <w:tmpl w:val="17C093BA"/>
+    <w:lvl w:ilvl="0" w:tplc="04090001">
+      <w:start w:val="1"/>
+      <w:numFmt w:val="bullet"/>
+      <w:lvlText w:val=""/>
+      <w:lvlJc w:val="left"/>
+      <w:pPr>
+        <w:ind w:left="720" w:hanging="360"/>
+      </w:pPr>
+      <w:rPr>
+        <w:rFonts w:ascii="Symbol" w:hAnsi="Symbol" w:hint="default"/>
+      </w:rPr>
+    </w:lvl>
+    <w:lvl w:ilvl="1" w:tplc="04090003" w:tentative="1">
+      <w:start w:val="1"/>
+      <w:numFmt w:val="bullet"/>
+      <w:lvlText w:val="o"/>
+      <w:lvlJc w:val="left"/>
+      <w:pPr>
+        <w:ind w:left="1440" w:hanging="360"/>
+      </w:pPr>
+      <w:rPr>
+        <w:rFonts w:ascii="Courier New" w:hAnsi="Courier New" w:cs="Courier New" w:hint="default"/>
+      </w:rPr>
+    </w:lvl>
+    <w:lvl w:ilvl="2" w:tplc="04090005" w:tentative="1">
+      <w:start w:val="1"/>
+      <w:numFmt w:val="bullet"/>
+      <w:lvlText w:val=""/>
+      <w:lvlJc w:val="left"/>
+      <w:pPr>
+        <w:ind w:left="2160" w:hanging="360"/>
+      </w:pPr>
+      <w:rPr>
+        <w:rFonts w:ascii="Wingdings" w:hAnsi="Wingdings" w:hint="default"/>
+      </w:rPr>
+    </w:lvl>
+    <w:lvl w:ilvl="3" w:tplc="04090001" w:tentative="1">
+      <w:start w:val="1"/>
+      <w:numFmt w:val="bullet"/>
+      <w:lvlText w:val=""/>
+      <w:lvlJc w:val="left"/>
+      <w:pPr>
+        <w:ind w:left="2880" w:hanging="360"/>
+      </w:pPr>
+      <w:rPr>
+        <w:rFonts w:ascii="Symbol" w:hAnsi="Symbol" w:hint="default"/>
+      </w:rPr>
+    </w:lvl>
+    <w:lvl w:ilvl="4" w:tplc="04090003" w:tentative="1">
+      <w:start w:val="1"/>
+      <w:numFmt w:val="bullet"/>
+      <w:lvlText w:val="o"/>
+      <w:lvlJc w:val="left"/>
+      <w:pPr>
+        <w:ind w:left="3600" w:hanging="360"/>
+      </w:pPr>
+      <w:rPr>
+        <w:rFonts w:ascii="Courier New" w:hAnsi="Courier New" w:cs="Courier New" w:hint="default"/>
+      </w:rPr>
+    </w:lvl>
+    <w:lvl w:ilvl="5" w:tplc="04090005" w:tentative="1">
+      <w:start w:val="1"/>
+      <w:numFmt w:val="bullet"/>
+      <w:lvlText w:val=""/>
+      <w:lvlJc w:val="left"/>
+      <w:pPr>
+        <w:ind w:left="4320" w:hanging="360"/>
+      </w:pPr>
+      <w:rPr>
+        <w:rFonts w:ascii="Wingdings" w:hAnsi="Wingdings" w:hint="default"/>
+      </w:rPr>
+    </w:lvl>
+    <w:lvl w:ilvl="6" w:tplc="04090001" w:tentative="1">
+      <w:start w:val="1"/>
+      <w:numFmt w:val="bullet"/>
+      <w:lvlText w:val=""/>
+      <w:lvlJc w:val="left"/>
+      <w:pPr>
+        <w:ind w:left="5040" w:hanging="360"/>
+      </w:pPr>
+      <w:rPr>
+        <w:rFonts w:ascii="Symbol" w:hAnsi="Symbol" w:hint="default"/>
+      </w:rPr>
+    </w:lvl>
+    <w:lvl w:ilvl="7" w:tplc="04090003" w:tentative="1">
+      <w:start w:val="1"/>
+      <w:numFmt w:val="bullet"/>
+      <w:lvlText w:val="o"/>
+      <w:lvlJc w:val="left"/>
+      <w:pPr>
+        <w:ind w:left="5760" w:hanging="360"/>
+      </w:pPr>
+      <w:rPr>
+        <w:rFonts w:ascii="Courier New" w:hAnsi="Courier New" w:cs="Courier New" w:hint="default"/>
+      </w:rPr>
+    </w:lvl>
+    <w:lvl w:ilvl="8" w:tplc="04090005" w:tentative="1">
+      <w:start w:val="1"/>
+      <w:numFmt w:val="bullet"/>
+      <w:lvlText w:val=""/>
+      <w:lvlJc w:val="left"/>
+      <w:pPr>
+        <w:ind w:left="6480" w:hanging="360"/>
+      </w:pPr>
+      <w:rPr>
+        <w:rFonts w:ascii="Wingdings" w:hAnsi="Wingdings" w:hint="default"/>
+      </w:rPr>
+    </w:lvl>
+  </w:abstractNum>
   <w:num w:numId="1" w16cid:durableId="1360619946">
+    <w:abstractNumId w:val="1"/>
+  </w:num>
+  <w:num w:numId="2" w16cid:durableId="1295716845">
+    <w:abstractNumId w:val="2"/>
+  </w:num>
+  <w:num w:numId="3" w16cid:durableId="77217543">
     <w:abstractNumId w:val="0"/>
   </w:num>
 </w:numbering>
@@ -1132,7 +1352,6 @@
   <w:style w:type="character" w:default="1" w:styleId="DefaultParagraphFont">
     <w:name w:val="Default Paragraph Font"/>
     <w:uiPriority w:val="1"/>
-    <w:semiHidden/>
     <w:unhideWhenUsed/>
   </w:style>
   <w:style w:type="table" w:default="1" w:styleId="TableNormal">
@@ -1199,6 +1418,17 @@
       <w:sz w:val="30"/>
       <w:szCs w:val="30"/>
     </w:rPr>
+  </w:style>
+  <w:style w:type="paragraph" w:styleId="ListParagraph">
+    <w:name w:val="List Paragraph"/>
+    <w:basedOn w:val="Normal"/>
+    <w:uiPriority w:val="34"/>
+    <w:qFormat/>
+    <w:rsid w:val="00C465E4"/>
+    <w:pPr>
+      <w:ind w:left="720"/>
+      <w:contextualSpacing/>
+    </w:pPr>
   </w:style>
 </w:styles>
 </file>

</xml_diff>

<commit_message>
Knowledge - 1-Academic - fix - 11/16/2025
</commit_message>
<xml_diff>
--- a/Knowledge/2-Science/0-Intro to Science/3-Wiki Source/Outline of science/Sources.docx
+++ b/Knowledge/2-Science/0-Intro to Science/3-Wiki Source/Outline of science/Sources.docx
@@ -14,38 +14,51 @@
       <w:r>
         <w:rPr>
           <w:b/>
-        </w:rPr>
-        <w:t>* Download Name</w:t>
-      </w:r>
-      <w:r>
-        <w:t xml:space="preserve">: </w:t>
-      </w:r>
-      <w:r>
-        <w:t>[</w:t>
-      </w:r>
-      <w:r>
-        <w:t>en_wikipedia_org_wiki_Outline_of_science</w:t>
-      </w:r>
-      <w:r>
-        <w:t>.pdf</w:t>
-      </w:r>
-      <w:r>
-        <w:t xml:space="preserve"> -&gt; </w:t>
-      </w:r>
-      <w:r>
-        <w:t>Outline of science.pdf</w:t>
-      </w:r>
-      <w:r>
-        <w:t xml:space="preserve">] </w:t>
-      </w:r>
-      <w:r>
-        <w:t>[</w:t>
-      </w:r>
-      <w:r>
-        <w:t>Wiki Source - Outline of science</w:t>
-      </w:r>
-      <w:r>
-        <w:t>]</w:t>
+          <w:bCs/>
+        </w:rPr>
+        <w:t>* Source ID</w:t>
+      </w:r>
+      <w:r>
+        <w:t>: 2</w:t>
+      </w:r>
+      <w:r>
+        <w:br/>
+      </w:r>
+      <w:r>
+        <w:rPr>
+          <w:b/>
+          <w:bCs/>
+        </w:rPr>
+        <w:t>* Content Title</w:t>
+      </w:r>
+      <w:r>
+        <w:t>: [en_wikipedia_org_wiki_Outline_of_science.pdf -&gt; Outline of science.pdf] [Wiki Source - Outline of science]</w:t>
+      </w:r>
+      <w:r>
+        <w:br/>
+      </w:r>
+      <w:r>
+        <w:rPr>
+          <w:b/>
+          <w:bCs/>
+        </w:rPr>
+        <w:t>* Content Type</w:t>
+      </w:r>
+      <w:r>
+        <w:t>: Document</w:t>
+      </w:r>
+      <w:r>
+        <w:br/>
+      </w:r>
+      <w:r>
+        <w:rPr>
+          <w:b/>
+          <w:bCs/>
+        </w:rPr>
+        <w:t>* Domain</w:t>
+      </w:r>
+      <w:r>
+        <w:t>: Educational</w:t>
       </w:r>
       <w:r>
         <w:br/>
@@ -55,10 +68,23 @@
         <w:rPr>
           <w:b/>
         </w:rPr>
-        <w:t>Download Type</w:t>
-      </w:r>
-      <w:r>
-        <w:t>: Document</w:t>
+        <w:t>Source Platform</w:t>
+      </w:r>
+      <w:r>
+        <w:t>: Wikipedia (https://www.wikipedia.org)</w:t>
+      </w:r>
+      <w:r>
+        <w:br/>
+      </w:r>
+      <w:r>
+        <w:rPr>
+          <w:b/>
+          <w:bCs/>
+        </w:rPr>
+        <w:t>* Source Reference:</w:t>
+      </w:r>
+      <w:r>
+        <w:t xml:space="preserve"> https://en.wikipedia.org/wiki/Outline_of_science</w:t>
       </w:r>
       <w:r>
         <w:br/>
@@ -68,170 +94,114 @@
         <w:rPr>
           <w:b/>
         </w:rPr>
-        <w:t>Source Type</w:t>
-      </w:r>
-      <w:r>
-        <w:t>: Educational</w:t>
-      </w:r>
-      <w:r>
-        <w:br/>
-      </w:r>
-      <w:r>
+        <w:t>Domain</w:t>
+      </w:r>
+      <w:r>
+        <w:t xml:space="preserve">: Converted </w:t>
+      </w:r>
+      <w:r>
+        <w:br/>
+      </w:r>
+      <w:r>
+        <w:rPr>
+          <w:b/>
+          <w:bCs/>
+        </w:rPr>
+        <w:t>* Source Nature:</w:t>
+      </w:r>
+      <w:r>
+        <w:t xml:space="preserve"> Digital</w:t>
+      </w:r>
+      <w:r>
+        <w:br/>
+      </w:r>
+      <w:r>
+        <w:rPr>
+          <w:b/>
+          <w:bCs/>
+        </w:rPr>
+        <w:t>* Storage Host:</w:t>
+      </w:r>
+      <w:r>
+        <w:t xml:space="preserve"> https://en.wikipedia.org [Wikipedia Server]</w:t>
+      </w:r>
+      <w:r>
+        <w:br/>
+      </w:r>
+      <w:r>
+        <w:rPr>
+          <w:b/>
+          <w:bCs/>
+        </w:rPr>
+        <w:t>* Acquisition Method:</w:t>
+      </w:r>
+      <w:r>
+        <w:t xml:space="preserve"> Web Tool: Sejda - HTML to PDF (https://www.sejda.com/html-to-pdf) [convert html to pdf]</w:t>
+      </w:r>
+      <w:r>
+        <w:br/>
+      </w:r>
+      <w:r>
+        <w:rPr>
+          <w:b/>
+          <w:bCs/>
+        </w:rPr>
+        <w:t>* File Format:</w:t>
+      </w:r>
+      <w:r>
+        <w:t xml:space="preserve"> .pdf</w:t>
+      </w:r>
+      <w:r>
+        <w:br/>
+      </w:r>
+      <w:r>
+        <w:rPr>
+          <w:b/>
+          <w:bCs/>
+        </w:rPr>
+        <w:t>* Content Quality:</w:t>
+      </w:r>
+      <w:r>
+        <w:t xml:space="preserve"> Medium </w:t>
+      </w:r>
+      <w:r>
+        <w:br/>
+      </w:r>
+      <w:r>
+        <w:rPr>
+          <w:b/>
+          <w:bCs/>
+        </w:rPr>
+        <w:t>* Acquisition Date:</w:t>
+      </w:r>
+      <w:r>
+        <w:t xml:space="preserve"> 7/14/2025</w:t>
+      </w:r>
+      <w:r>
+        <w:br/>
+      </w:r>
+      <w:r>
+        <w:rPr>
+          <w:b/>
+          <w:bCs/>
+        </w:rPr>
+        <w:t>* Storage Location:</w:t>
+      </w:r>
+      <w:r>
+        <w:t xml:space="preserve"> StorageType: Cloud -&gt; Platform: GitHub -&gt; Account: topicsscience -&gt; Repository: kingdomheartsknowledge -&gt; Path: Knowledge/2-Science/0-Intro to Science/..</w:t>
+      </w:r>
+      <w:r>
+        <w:br/>
         <w:t xml:space="preserve">* </w:t>
       </w:r>
       <w:r>
         <w:rPr>
           <w:b/>
-          <w:bCs/>
-        </w:rPr>
-        <w:t>Source Platform</w:t>
-      </w:r>
-      <w:r>
-        <w:t>: Wikipedia (https://www.wikipedia.org)</w:t>
-      </w:r>
-      <w:r>
-        <w:br/>
-        <w:t xml:space="preserve">* </w:t>
-      </w:r>
-      <w:r>
-        <w:rPr>
-          <w:b/>
-        </w:rPr>
-        <w:t>Download Source</w:t>
-      </w:r>
-      <w:r>
-        <w:t xml:space="preserve">: </w:t>
-      </w:r>
-      <w:hyperlink r:id="rId5">
-        <w:r>
-          <w:rPr>
-            <w:color w:val="1155CC"/>
-            <w:u w:val="single"/>
-          </w:rPr>
-          <w:t>https://en.wikipedia.org/wiki/Outline_of_science</w:t>
-        </w:r>
-      </w:hyperlink>
-      <w:r>
-        <w:br/>
-        <w:t xml:space="preserve">* </w:t>
-      </w:r>
-      <w:r>
-        <w:rPr>
-          <w:b/>
-        </w:rPr>
-        <w:t>Download Server / Mirror</w:t>
-      </w:r>
-      <w:r>
-        <w:t xml:space="preserve">: </w:t>
-      </w:r>
-      <w:r>
-        <w:t>https://en.wikipedia.org [Wikipedia Server]</w:t>
-      </w:r>
-      <w:r>
-        <w:br/>
-        <w:t xml:space="preserve">* </w:t>
-      </w:r>
-      <w:r>
-        <w:rPr>
-          <w:b/>
-        </w:rPr>
-        <w:t>Download Method</w:t>
-      </w:r>
-      <w:r>
-        <w:t xml:space="preserve">: </w:t>
-      </w:r>
-      <w:r>
-        <w:t>Web Tool: Sejda - HTML to PDF (https://www.sejda.com/html-to-pdf) [convert html to pdf]</w:t>
-      </w:r>
-      <w:r>
-        <w:br/>
-      </w:r>
-      <w:r>
-        <w:t xml:space="preserve">* </w:t>
-      </w:r>
-      <w:r>
-        <w:rPr>
-          <w:b/>
-        </w:rPr>
-        <w:t>Download Format</w:t>
-      </w:r>
-      <w:r>
-        <w:t>: .pdf</w:t>
-      </w:r>
-      <w:r>
-        <w:br/>
-        <w:t xml:space="preserve">* </w:t>
-      </w:r>
-      <w:r>
-        <w:rPr>
-          <w:b/>
-        </w:rPr>
-        <w:t>Download Quality</w:t>
-      </w:r>
-      <w:r>
-        <w:t xml:space="preserve">: Medium </w:t>
-      </w:r>
-      <w:r>
-        <w:br/>
-        <w:t xml:space="preserve">* </w:t>
-      </w:r>
-      <w:r>
-        <w:rPr>
-          <w:b/>
-        </w:rPr>
-        <w:t>Download Date</w:t>
-      </w:r>
-      <w:r>
-        <w:t>: 7/14/2025</w:t>
-      </w:r>
-      <w:r>
-        <w:br/>
-      </w:r>
-      <w:r>
-        <w:t xml:space="preserve">* </w:t>
-      </w:r>
-      <w:r>
-        <w:rPr>
-          <w:b/>
-          <w:bCs/>
-        </w:rPr>
-        <w:t>Saved Location</w:t>
-      </w:r>
-      <w:r>
-        <w:t>: StorageType: Cloud -&gt; Platform: GitHub -&gt; Account: topicsscience -&gt; Repository: kingdomheartsknowledge -&gt; Path: Knowledge/2-Science/0-Intro to Science/..</w:t>
-      </w:r>
-      <w:r>
-        <w:br/>
-      </w:r>
-      <w:r>
-        <w:t xml:space="preserve">* </w:t>
-      </w:r>
-      <w:r>
-        <w:rPr>
-          <w:b/>
-        </w:rPr>
-        <w:t xml:space="preserve">Notes: </w:t>
-      </w:r>
-      <w:r>
-        <w:rPr>
-          <w:sz w:val="20"/>
-          <w:szCs w:val="20"/>
-        </w:rPr>
-        <w:t>Wiki Source -</w:t>
-      </w:r>
-      <w:r>
-        <w:rPr>
-          <w:sz w:val="24"/>
-          <w:szCs w:val="24"/>
-        </w:rPr>
-        <w:t xml:space="preserve"> </w:t>
-      </w:r>
-      <w:r>
-        <w:rPr>
-          <w:sz w:val="18"/>
-          <w:szCs w:val="18"/>
-        </w:rPr>
-        <w:t>[This page was last edited on 9 June 2025, at 15:29 (UTC)]</w:t>
+        </w:rPr>
+        <w:t>Notes</w:t>
+      </w:r>
+      <w:r>
+        <w:t>: Wiki Source - [This page was last edited on 9 June 2025, at 15:29 (UTC)]</w:t>
       </w:r>
     </w:p>
     <w:p>
@@ -260,32 +230,51 @@
       <w:r>
         <w:rPr>
           <w:b/>
-        </w:rPr>
-        <w:t>* Download Name</w:t>
-      </w:r>
-      <w:r>
-        <w:t xml:space="preserve">: </w:t>
-      </w:r>
-      <w:r>
-        <w:t>[</w:t>
-      </w:r>
-      <w:r>
-        <w:t>en_wikipedia_org_wiki_Branches_of_science</w:t>
-      </w:r>
-      <w:r>
-        <w:t xml:space="preserve">.pdf -&gt; </w:t>
-      </w:r>
-      <w:r>
-        <w:t>Branches of science.pdf</w:t>
-      </w:r>
-      <w:r>
-        <w:t>] [</w:t>
-      </w:r>
-      <w:r>
-        <w:t>Wiki Source - Branches of science</w:t>
-      </w:r>
-      <w:r>
-        <w:t>]</w:t>
+          <w:bCs/>
+        </w:rPr>
+        <w:t>* Source ID:</w:t>
+      </w:r>
+      <w:r>
+        <w:t xml:space="preserve"> 3</w:t>
+      </w:r>
+      <w:r>
+        <w:br/>
+      </w:r>
+      <w:r>
+        <w:rPr>
+          <w:b/>
+          <w:bCs/>
+        </w:rPr>
+        <w:t>* Content Title:</w:t>
+      </w:r>
+      <w:r>
+        <w:t xml:space="preserve"> [en_wikipedia_org_wiki_Branches_of_science.pdf -&gt; Branches of science.pdf] [Wiki Source - Branches of science]</w:t>
+      </w:r>
+      <w:r>
+        <w:br/>
+      </w:r>
+      <w:r>
+        <w:rPr>
+          <w:b/>
+          <w:bCs/>
+        </w:rPr>
+        <w:t>* Content Type:</w:t>
+      </w:r>
+      <w:r>
+        <w:t xml:space="preserve"> Document</w:t>
+      </w:r>
+      <w:r>
+        <w:br/>
+      </w:r>
+      <w:r>
+        <w:rPr>
+          <w:b/>
+          <w:bCs/>
+        </w:rPr>
+        <w:t>* Domain:</w:t>
+      </w:r>
+      <w:r>
+        <w:t xml:space="preserve"> Educational</w:t>
       </w:r>
       <w:r>
         <w:br/>
@@ -295,10 +284,23 @@
         <w:rPr>
           <w:b/>
         </w:rPr>
-        <w:t>Download Type</w:t>
-      </w:r>
-      <w:r>
-        <w:t>: Document</w:t>
+        <w:t>Source Platform</w:t>
+      </w:r>
+      <w:r>
+        <w:t>: Wikipedia (https://www.wikipedia.org)</w:t>
+      </w:r>
+      <w:r>
+        <w:br/>
+      </w:r>
+      <w:r>
+        <w:rPr>
+          <w:b/>
+          <w:bCs/>
+        </w:rPr>
+        <w:t>* Source Reference:</w:t>
+      </w:r>
+      <w:r>
+        <w:t xml:space="preserve"> https://en.wikipedia.org/wiki/Branches_of_science</w:t>
       </w:r>
       <w:r>
         <w:br/>
@@ -308,194 +310,119 @@
         <w:rPr>
           <w:b/>
         </w:rPr>
-        <w:t>Source Type</w:t>
-      </w:r>
-      <w:r>
-        <w:t>: Educational</w:t>
-      </w:r>
-      <w:r>
-        <w:br/>
-      </w:r>
-      <w:r>
+        <w:t>Domain</w:t>
+      </w:r>
+      <w:r>
+        <w:t xml:space="preserve">: Converted </w:t>
+      </w:r>
+      <w:r>
+        <w:br/>
+      </w:r>
+      <w:r>
+        <w:rPr>
+          <w:b/>
+          <w:bCs/>
+        </w:rPr>
+        <w:t>* Source Nature:</w:t>
+      </w:r>
+      <w:r>
+        <w:t xml:space="preserve"> Digital</w:t>
+      </w:r>
+      <w:r>
+        <w:br/>
+      </w:r>
+      <w:r>
+        <w:rPr>
+          <w:b/>
+          <w:bCs/>
+        </w:rPr>
+        <w:t>* Storage Host:</w:t>
+      </w:r>
+      <w:r>
+        <w:t xml:space="preserve"> https://en.wikipedia.org [Wikipedia Server]</w:t>
+      </w:r>
+      <w:r>
+        <w:br/>
+      </w:r>
+      <w:r>
+        <w:rPr>
+          <w:b/>
+          <w:bCs/>
+        </w:rPr>
+        <w:t>* Acquisition Method:</w:t>
+      </w:r>
+      <w:r>
+        <w:t xml:space="preserve"> Web Tool: Sejda - HTML to PDF (https://www.sejda.com/html-to-pdf) [convert html to pdf]</w:t>
+      </w:r>
+      <w:r>
+        <w:br/>
+      </w:r>
+      <w:r>
+        <w:rPr>
+          <w:b/>
+          <w:bCs/>
+        </w:rPr>
+        <w:t>* File Format:</w:t>
+      </w:r>
+      <w:r>
+        <w:t xml:space="preserve"> .pdf</w:t>
+      </w:r>
+      <w:r>
+        <w:br/>
+      </w:r>
+      <w:r>
+        <w:rPr>
+          <w:b/>
+          <w:bCs/>
+        </w:rPr>
+        <w:t>* Content Quality:</w:t>
+      </w:r>
+      <w:r>
+        <w:t xml:space="preserve"> Medium </w:t>
+      </w:r>
+      <w:r>
+        <w:br/>
+      </w:r>
+      <w:r>
+        <w:rPr>
+          <w:b/>
+          <w:bCs/>
+        </w:rPr>
+        <w:t>* Acquisition Date:</w:t>
+      </w:r>
+      <w:r>
+        <w:t xml:space="preserve"> 7/14/2025</w:t>
+      </w:r>
+      <w:r>
+        <w:br/>
+      </w:r>
+      <w:r>
+        <w:rPr>
+          <w:b/>
+          <w:bCs/>
+        </w:rPr>
+        <w:t>* Storage Location:</w:t>
+      </w:r>
+      <w:r>
+        <w:t xml:space="preserve"> StorageType: Cloud -&gt; Platform: GitHub -&gt; Account: topicsscience -&gt; Repository: kingdomheartsknowledge -&gt; Path: Knowledge/2-Science/0-Intro to Science/..</w:t>
+      </w:r>
+      <w:r>
+        <w:br/>
         <w:t xml:space="preserve">* </w:t>
       </w:r>
       <w:r>
         <w:rPr>
           <w:b/>
-          <w:bCs/>
-        </w:rPr>
-        <w:t>Source Platform</w:t>
-      </w:r>
-      <w:r>
-        <w:t>: Wikipedia (https://www.wikipedia.org)</w:t>
-      </w:r>
-      <w:r>
-        <w:br/>
-        <w:t xml:space="preserve">* </w:t>
-      </w:r>
-      <w:r>
-        <w:rPr>
-          <w:b/>
-        </w:rPr>
-        <w:t>Download Source</w:t>
-      </w:r>
-      <w:r>
-        <w:t xml:space="preserve">: </w:t>
-      </w:r>
-      <w:hyperlink r:id="rId6">
-        <w:r>
-          <w:rPr>
-            <w:color w:val="1155CC"/>
-            <w:u w:val="single"/>
-          </w:rPr>
-          <w:t>https://en.wikipedia.org/wiki/Branches_of_science</w:t>
-        </w:r>
-      </w:hyperlink>
-      <w:r>
-        <w:br/>
-      </w:r>
-      <w:r>
-        <w:t xml:space="preserve">* </w:t>
-      </w:r>
-      <w:r>
-        <w:rPr>
-          <w:b/>
-        </w:rPr>
-        <w:t>Download Server / Mirror</w:t>
-      </w:r>
-      <w:r>
-        <w:t xml:space="preserve">: </w:t>
-      </w:r>
-      <w:r>
-        <w:t>https://en.wikipedia.org [Wikipedia Server]</w:t>
-      </w:r>
-      <w:r>
-        <w:br/>
-        <w:t xml:space="preserve">* </w:t>
-      </w:r>
-      <w:r>
-        <w:rPr>
-          <w:b/>
-        </w:rPr>
-        <w:t>Download Method</w:t>
-      </w:r>
-      <w:r>
-        <w:t xml:space="preserve">: </w:t>
-      </w:r>
-      <w:r>
-        <w:t>Web Tool: Sejda - HTML to PDF (https://www.sejda.com/html-to-pdf) [convert html to pdf]</w:t>
-      </w:r>
-      <w:r>
-        <w:br/>
-      </w:r>
-      <w:r>
-        <w:t xml:space="preserve">* </w:t>
-      </w:r>
-      <w:r>
-        <w:rPr>
-          <w:b/>
-        </w:rPr>
-        <w:t>Download Format</w:t>
-      </w:r>
-      <w:r>
-        <w:t>: .pdf</w:t>
-      </w:r>
-      <w:r>
-        <w:br/>
-        <w:t xml:space="preserve">* </w:t>
-      </w:r>
-      <w:r>
-        <w:rPr>
-          <w:b/>
-        </w:rPr>
-        <w:t>Download Quality</w:t>
-      </w:r>
-      <w:r>
-        <w:t xml:space="preserve">: Medium </w:t>
-      </w:r>
-      <w:r>
-        <w:br/>
-        <w:t xml:space="preserve">* </w:t>
-      </w:r>
-      <w:r>
-        <w:rPr>
-          <w:b/>
-        </w:rPr>
-        <w:t>Download Date</w:t>
-      </w:r>
-      <w:r>
-        <w:t>: 7/14/2025</w:t>
-      </w:r>
-      <w:r>
-        <w:br/>
-      </w:r>
-      <w:r>
-        <w:t xml:space="preserve">* </w:t>
-      </w:r>
-      <w:r>
-        <w:rPr>
-          <w:b/>
-          <w:bCs/>
-        </w:rPr>
-        <w:t>Saved Location</w:t>
-      </w:r>
-      <w:r>
-        <w:t>: StorageType: Cloud -&gt; Platform: GitHub -&gt; Account: topicsscience -&gt; Repository: kingdomheartsknowledge -&gt; Path: Knowledge/2-Science/0-Intro to Science/..</w:t>
-      </w:r>
-      <w:r>
-        <w:br/>
-      </w:r>
-      <w:r>
-        <w:t xml:space="preserve">* </w:t>
-      </w:r>
-      <w:r>
-        <w:rPr>
-          <w:b/>
-        </w:rPr>
-        <w:t xml:space="preserve">Notes: </w:t>
-      </w:r>
-      <w:r>
-        <w:rPr>
-          <w:sz w:val="20"/>
-          <w:szCs w:val="20"/>
-        </w:rPr>
-        <w:t xml:space="preserve">Wiki Source - </w:t>
-      </w:r>
-      <w:r>
-        <w:rPr>
-          <w:sz w:val="18"/>
-          <w:szCs w:val="18"/>
-        </w:rPr>
-        <w:t>[This page was last edited on 30 June 2025, at 10:10 (UTC)]</w:t>
-      </w:r>
-      <w:r>
-        <w:rPr>
-          <w:sz w:val="18"/>
-          <w:szCs w:val="18"/>
-        </w:rPr>
-        <w:br/>
-      </w:r>
-      <w:r>
-        <w:rPr>
-          <w:sz w:val="18"/>
-          <w:szCs w:val="18"/>
-        </w:rPr>
-        <w:br/>
-      </w:r>
-    </w:p>
-    <w:p>
-      <w:pPr>
-        <w:ind w:left="720"/>
-        <w:rPr>
-          <w:sz w:val="18"/>
-          <w:szCs w:val="18"/>
-        </w:rPr>
-      </w:pPr>
-      <w:r>
-        <w:rPr>
-          <w:sz w:val="18"/>
-          <w:szCs w:val="18"/>
-        </w:rPr>
+        </w:rPr>
+        <w:t>Notes</w:t>
+      </w:r>
+      <w:r>
+        <w:t>: Wiki Source - [This page was last edited on 30 June 2025, at 10:10 (UTC)]</w:t>
+      </w:r>
+      <w:r>
+        <w:br/>
+      </w:r>
+      <w:r>
         <w:br/>
       </w:r>
     </w:p>
@@ -1352,6 +1279,7 @@
   <w:style w:type="character" w:default="1" w:styleId="DefaultParagraphFont">
     <w:name w:val="Default Paragraph Font"/>
     <w:uiPriority w:val="1"/>
+    <w:semiHidden/>
     <w:unhideWhenUsed/>
   </w:style>
   <w:style w:type="table" w:default="1" w:styleId="TableNormal">
@@ -1429,6 +1357,29 @@
       <w:ind w:left="720"/>
       <w:contextualSpacing/>
     </w:pPr>
+  </w:style>
+  <w:style w:type="character" w:styleId="Hyperlink">
+    <w:name w:val="Hyperlink"/>
+    <w:basedOn w:val="DefaultParagraphFont"/>
+    <w:uiPriority w:val="99"/>
+    <w:unhideWhenUsed/>
+    <w:rsid w:val="00D44442"/>
+    <w:rPr>
+      <w:color w:val="0000FF" w:themeColor="hyperlink"/>
+      <w:u w:val="single"/>
+    </w:rPr>
+  </w:style>
+  <w:style w:type="character" w:styleId="UnresolvedMention">
+    <w:name w:val="Unresolved Mention"/>
+    <w:basedOn w:val="DefaultParagraphFont"/>
+    <w:uiPriority w:val="99"/>
+    <w:semiHidden/>
+    <w:unhideWhenUsed/>
+    <w:rsid w:val="00D44442"/>
+    <w:rPr>
+      <w:color w:val="605E5C"/>
+      <w:shd w:val="clear" w:color="auto" w:fill="E1DFDD"/>
+    </w:rPr>
   </w:style>
 </w:styles>
 </file>

</xml_diff>